<commit_message>
Day26 practice object, Static block, Instance block
</commit_message>
<xml_diff>
--- a/JavaRevision/Notes.docx
+++ b/JavaRevision/Notes.docx
@@ -1,6 +1,6 @@
 
 <file path=word/document.xml><?xml version="1.0" encoding="utf-8"?>
-<w:document xmlns:wpc="http://schemas.microsoft.com/office/word/2010/wordprocessingCanvas" xmlns:cx="http://schemas.microsoft.com/office/drawing/2014/chartex" xmlns:cx1="http://schemas.microsoft.com/office/drawing/2015/9/8/chartex" xmlns:cx2="http://schemas.microsoft.com/office/drawing/2015/10/21/chartex" xmlns:cx3="http://schemas.microsoft.com/office/drawing/2016/5/9/chartex" xmlns:cx4="http://schemas.microsoft.com/office/drawing/2016/5/10/chartex" xmlns:cx5="http://schemas.microsoft.com/office/drawing/2016/5/11/chartex" xmlns:cx6="http://schemas.microsoft.com/office/drawing/2016/5/12/chartex" xmlns:cx7="http://schemas.microsoft.com/office/drawing/2016/5/13/chartex" xmlns:cx8="http://schemas.microsoft.com/office/drawing/2016/5/14/chartex" xmlns:mc="http://schemas.openxmlformats.org/markup-compatibility/2006" xmlns:aink="http://schemas.microsoft.com/office/drawing/2016/ink" xmlns:am3d="http://schemas.microsoft.com/office/drawing/2017/model3d" xmlns:o="urn:schemas-microsoft-com:office:office" xmlns:r="http://schemas.openxmlformats.org/officeDocument/2006/relationships" xmlns:m="http://schemas.openxmlformats.org/officeDocument/2006/math" xmlns:v="urn:schemas-microsoft-com:vml" xmlns:wp14="http://schemas.microsoft.com/office/word/2010/wordprocessingDrawing" xmlns:wp="http://schemas.openxmlformats.org/drawingml/2006/wordprocessingDrawing" xmlns:w10="urn:schemas-microsoft-com:office:word" xmlns:w="http://schemas.openxmlformats.org/wordprocessingml/2006/main" xmlns:w14="http://schemas.microsoft.com/office/word/2010/wordml" xmlns:w15="http://schemas.microsoft.com/office/word/2012/wordml" xmlns:w16cex="http://schemas.microsoft.com/office/word/2018/wordml/cex" xmlns:w16cid="http://schemas.microsoft.com/office/word/2016/wordml/cid" xmlns:w16="http://schemas.microsoft.com/office/word/2018/wordml" xmlns:w16sdtdh="http://schemas.microsoft.com/office/word/2020/wordml/sdtdatahash" xmlns:w16se="http://schemas.microsoft.com/office/word/2015/wordml/symex" xmlns:wpg="http://schemas.microsoft.com/office/word/2010/wordprocessingGroup" xmlns:wpi="http://schemas.microsoft.com/office/word/2010/wordprocessingInk" xmlns:wne="http://schemas.microsoft.com/office/word/2006/wordml" xmlns:wps="http://schemas.microsoft.com/office/word/2010/wordprocessingShape" mc:Ignorable="w14 w15 w16se w16cid w16 w16cex w16sdtdh wp14">
+<w:document xmlns:wpc="http://schemas.microsoft.com/office/word/2010/wordprocessingCanvas" xmlns:cx="http://schemas.microsoft.com/office/drawing/2014/chartex" xmlns:cx1="http://schemas.microsoft.com/office/drawing/2015/9/8/chartex" xmlns:cx2="http://schemas.microsoft.com/office/drawing/2015/10/21/chartex" xmlns:cx3="http://schemas.microsoft.com/office/drawing/2016/5/9/chartex" xmlns:cx4="http://schemas.microsoft.com/office/drawing/2016/5/10/chartex" xmlns:cx5="http://schemas.microsoft.com/office/drawing/2016/5/11/chartex" xmlns:cx6="http://schemas.microsoft.com/office/drawing/2016/5/12/chartex" xmlns:cx7="http://schemas.microsoft.com/office/drawing/2016/5/13/chartex" xmlns:cx8="http://schemas.microsoft.com/office/drawing/2016/5/14/chartex" xmlns:mc="http://schemas.openxmlformats.org/markup-compatibility/2006" xmlns:aink="http://schemas.microsoft.com/office/drawing/2016/ink" xmlns:am3d="http://schemas.microsoft.com/office/drawing/2017/model3d" xmlns:o="urn:schemas-microsoft-com:office:office" xmlns:oel="http://schemas.microsoft.com/office/2019/extlst" xmlns:r="http://schemas.openxmlformats.org/officeDocument/2006/relationships" xmlns:m="http://schemas.openxmlformats.org/officeDocument/2006/math" xmlns:v="urn:schemas-microsoft-com:vml" xmlns:wp14="http://schemas.microsoft.com/office/word/2010/wordprocessingDrawing" xmlns:wp="http://schemas.openxmlformats.org/drawingml/2006/wordprocessingDrawing" xmlns:w10="urn:schemas-microsoft-com:office:word" xmlns:w="http://schemas.openxmlformats.org/wordprocessingml/2006/main" xmlns:w14="http://schemas.microsoft.com/office/word/2010/wordml" xmlns:w15="http://schemas.microsoft.com/office/word/2012/wordml" xmlns:w16cex="http://schemas.microsoft.com/office/word/2018/wordml/cex" xmlns:w16cid="http://schemas.microsoft.com/office/word/2016/wordml/cid" xmlns:w16="http://schemas.microsoft.com/office/word/2018/wordml" xmlns:w16du="http://schemas.microsoft.com/office/word/2023/wordml/word16du" xmlns:w16sdtdh="http://schemas.microsoft.com/office/word/2020/wordml/sdtdatahash" xmlns:w16sdtfl="http://schemas.microsoft.com/office/word/2024/wordml/sdtformatlock" xmlns:w16se="http://schemas.microsoft.com/office/word/2015/wordml/symex" xmlns:wpg="http://schemas.microsoft.com/office/word/2010/wordprocessingGroup" xmlns:wpi="http://schemas.microsoft.com/office/word/2010/wordprocessingInk" xmlns:wne="http://schemas.microsoft.com/office/word/2006/wordml" xmlns:wps="http://schemas.microsoft.com/office/word/2010/wordprocessingShape" mc:Ignorable="w14 w15 w16se w16cid w16 w16cex w16sdtdh w16sdtfl w16du wp14">
   <w:background w:color="FFFFFF" w:themeColor="background1"/>
   <w:body>
     <w:p>
@@ -128,7 +128,7 @@
           </mc:Choice>
           <mc:Fallback>
             <w:pict>
-              <v:rect w14:anchorId="1879A2C1" id="Rectangle 1" o:spid="_x0000_s1026" style="position:absolute;margin-left:24.15pt;margin-top:52.65pt;width:70.5pt;height:1in;z-index:-251657216;visibility:visible;mso-wrap-style:square;mso-width-percent:0;mso-height-percent:0;mso-wrap-distance-left:9pt;mso-wrap-distance-top:0;mso-wrap-distance-right:9pt;mso-wrap-distance-bottom:0;mso-position-horizontal:absolute;mso-position-horizontal-relative:text;mso-position-vertical:absolute;mso-position-vertical-relative:text;mso-width-percent:0;mso-height-percent:0;mso-width-relative:margin;mso-height-relative:margin;v-text-anchor:middle" o:gfxdata="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" fillcolor="white [3201]" strokecolor="#70ad47 [3209]" strokeweight="1pt">
+              <v:rect w14:anchorId="1879A2C1" id="Rectangle 1" o:spid="_x0000_s1026" style="position:absolute;margin-left:24.15pt;margin-top:52.65pt;width:70.5pt;height:1in;z-index:-251657216;visibility:visible;mso-wrap-style:square;mso-width-percent:0;mso-height-percent:0;mso-wrap-distance-left:9pt;mso-wrap-distance-top:0;mso-wrap-distance-right:9pt;mso-wrap-distance-bottom:0;mso-position-horizontal:absolute;mso-position-horizontal-relative:text;mso-position-vertical:absolute;mso-position-vertical-relative:text;mso-width-percent:0;mso-height-percent:0;mso-width-relative:margin;mso-height-relative:margin;v-text-anchor:middle" o:gfxdata="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" fillcolor="white [3201]" strokecolor="#70ad47 [3209]" strokeweight="1pt">
                 <v:textbox>
                   <w:txbxContent>
                     <w:p>
@@ -296,7 +296,7 @@
           </mc:Choice>
           <mc:Fallback>
             <w:pict>
-              <v:rect w14:anchorId="7E5ACDAE" id="Rectangle 8" o:spid="_x0000_s1027" style="position:absolute;margin-left:384.15pt;margin-top:12.9pt;width:61.5pt;height:54pt;z-index:251666432;visibility:visible;mso-wrap-style:square;mso-wrap-distance-left:9pt;mso-wrap-distance-top:0;mso-wrap-distance-right:9pt;mso-wrap-distance-bottom:0;mso-position-horizontal:absolute;mso-position-horizontal-relative:text;mso-position-vertical:absolute;mso-position-vertical-relative:text;v-text-anchor:middle" o:gfxdata="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" fillcolor="white [3201]" strokecolor="#70ad47 [3209]" strokeweight="1pt">
+              <v:rect w14:anchorId="7E5ACDAE" id="Rectangle 8" o:spid="_x0000_s1027" style="position:absolute;margin-left:384.15pt;margin-top:12.9pt;width:61.5pt;height:54pt;z-index:251666432;visibility:visible;mso-wrap-style:square;mso-wrap-distance-left:9pt;mso-wrap-distance-top:0;mso-wrap-distance-right:9pt;mso-wrap-distance-bottom:0;mso-position-horizontal:absolute;mso-position-horizontal-relative:text;mso-position-vertical:absolute;mso-position-vertical-relative:text;v-text-anchor:middle" o:gfxdata="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" fillcolor="white [3201]" strokecolor="#70ad47 [3209]" strokeweight="1pt">
                 <v:textbox>
                   <w:txbxContent>
                     <w:p>
@@ -405,7 +405,7 @@
           </mc:Choice>
           <mc:Fallback>
             <w:pict>
-              <v:roundrect w14:anchorId="212EDC0F" id="Rectangle: Rounded Corners 5" o:spid="_x0000_s1028" style="position:absolute;margin-left:307.65pt;margin-top:22.65pt;width:47.25pt;height:40.5pt;z-index:251663360;visibility:visible;mso-wrap-style:square;mso-wrap-distance-left:9pt;mso-wrap-distance-top:0;mso-wrap-distance-right:9pt;mso-wrap-distance-bottom:0;mso-position-horizontal:absolute;mso-position-horizontal-relative:text;mso-position-vertical:absolute;mso-position-vertical-relative:text;v-text-anchor:middle" arcsize="10923f" o:gfxdata="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" fillcolor="#4472c4 [3204]" strokecolor="#1f3763 [1604]" strokeweight="1pt">
+              <v:roundrect w14:anchorId="212EDC0F" id="Rectangle: Rounded Corners 5" o:spid="_x0000_s1028" style="position:absolute;margin-left:307.65pt;margin-top:22.65pt;width:47.25pt;height:40.5pt;z-index:251663360;visibility:visible;mso-wrap-style:square;mso-wrap-distance-left:9pt;mso-wrap-distance-top:0;mso-wrap-distance-right:9pt;mso-wrap-distance-bottom:0;mso-position-horizontal:absolute;mso-position-horizontal-relative:text;mso-position-vertical:absolute;mso-position-vertical-relative:text;v-text-anchor:middle" arcsize="10923f" o:gfxdata="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" fillcolor="#4472c4 [3204]" strokecolor="#1f3763 [1604]" strokeweight="1pt">
                 <v:stroke joinstyle="miter"/>
                 <v:textbox>
                   <w:txbxContent>
@@ -514,7 +514,7 @@
                 <v:stroke joinstyle="miter"/>
                 <v:path gradientshapeok="t" o:connecttype="rect"/>
               </v:shapetype>
-              <v:shape id="Text Box 4" o:spid="_x0000_s1029" type="#_x0000_t202" style="position:absolute;margin-left:203.4pt;margin-top:9.15pt;width:60pt;height:69pt;z-index:251662336;visibility:visible;mso-wrap-style:square;mso-width-percent:0;mso-wrap-distance-left:9pt;mso-wrap-distance-top:0;mso-wrap-distance-right:9pt;mso-wrap-distance-bottom:0;mso-position-horizontal:absolute;mso-position-horizontal-relative:text;mso-position-vertical:absolute;mso-position-vertical-relative:text;mso-width-percent:0;mso-width-relative:margin;v-text-anchor:top" o:gfxdata="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" fillcolor="white [3201]" strokeweight=".5pt">
+              <v:shape id="Text Box 4" o:spid="_x0000_s1029" type="#_x0000_t202" style="position:absolute;margin-left:203.4pt;margin-top:9.15pt;width:60pt;height:69pt;z-index:251662336;visibility:visible;mso-wrap-style:square;mso-width-percent:0;mso-wrap-distance-left:9pt;mso-wrap-distance-top:0;mso-wrap-distance-right:9pt;mso-wrap-distance-bottom:0;mso-position-horizontal:absolute;mso-position-horizontal-relative:text;mso-position-vertical:absolute;mso-position-vertical-relative:text;mso-width-percent:0;mso-width-relative:margin;v-text-anchor:top" o:gfxdata="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" fillcolor="white [3201]" strokeweight=".5pt">
                 <v:textbox>
                   <w:txbxContent>
                     <w:p>
@@ -1019,7 +1019,7 @@
           </mc:Choice>
           <mc:Fallback>
             <w:pict>
-              <v:rect w14:anchorId="35E6CAFF" id="Rectangle 15" o:spid="_x0000_s1030" style="position:absolute;left:0;text-align:left;margin-left:34.65pt;margin-top:20.45pt;width:176.9pt;height:118.5pt;z-index:251671552;visibility:visible;mso-wrap-style:square;mso-width-percent:0;mso-height-percent:0;mso-wrap-distance-left:9pt;mso-wrap-distance-top:0;mso-wrap-distance-right:9pt;mso-wrap-distance-bottom:0;mso-position-horizontal:absolute;mso-position-horizontal-relative:text;mso-position-vertical:absolute;mso-position-vertical-relative:text;mso-width-percent:0;mso-height-percent:0;mso-width-relative:margin;mso-height-relative:margin;v-text-anchor:middle" o:gfxdata="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" fillcolor="#70ad47 [3209]" strokecolor="#0d0d0d [3069]">
+              <v:rect w14:anchorId="35E6CAFF" id="Rectangle 15" o:spid="_x0000_s1030" style="position:absolute;left:0;text-align:left;margin-left:34.65pt;margin-top:20.45pt;width:176.9pt;height:118.5pt;z-index:251671552;visibility:visible;mso-wrap-style:square;mso-width-percent:0;mso-height-percent:0;mso-wrap-distance-left:9pt;mso-wrap-distance-top:0;mso-wrap-distance-right:9pt;mso-wrap-distance-bottom:0;mso-position-horizontal:absolute;mso-position-horizontal-relative:text;mso-position-vertical:absolute;mso-position-vertical-relative:text;mso-width-percent:0;mso-height-percent:0;mso-width-relative:margin;mso-height-relative:margin;v-text-anchor:middle" o:gfxdata="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" fillcolor="#70ad47 [3209]" strokecolor="#0d0d0d [3069]">
                 <v:fill opacity="32896f"/>
                 <v:textbox>
                   <w:txbxContent>
@@ -1240,7 +1240,7 @@
           </mc:Choice>
           <mc:Fallback>
             <w:pict>
-              <v:oval w14:anchorId="763DF2C7" id="Oval 11" o:spid="_x0000_s1031" style="position:absolute;margin-left:39.15pt;margin-top:5.6pt;width:122.15pt;height:101.2pt;z-index:-251646976;visibility:visible;mso-wrap-style:square;mso-width-percent:0;mso-height-percent:0;mso-wrap-distance-left:9pt;mso-wrap-distance-top:0;mso-wrap-distance-right:9pt;mso-wrap-distance-bottom:0;mso-position-horizontal:absolute;mso-position-horizontal-relative:text;mso-position-vertical:absolute;mso-position-vertical-relative:text;mso-width-percent:0;mso-height-percent:0;mso-width-relative:margin;mso-height-relative:margin;v-text-anchor:middle" o:gfxdata="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" fillcolor="white [3201]" strokecolor="#70ad47 [3209]" strokeweight="1pt">
+              <v:oval w14:anchorId="763DF2C7" id="Oval 11" o:spid="_x0000_s1031" style="position:absolute;margin-left:39.15pt;margin-top:5.6pt;width:122.15pt;height:101.2pt;z-index:-251646976;visibility:visible;mso-wrap-style:square;mso-width-percent:0;mso-height-percent:0;mso-wrap-distance-left:9pt;mso-wrap-distance-top:0;mso-wrap-distance-right:9pt;mso-wrap-distance-bottom:0;mso-position-horizontal:absolute;mso-position-horizontal-relative:text;mso-position-vertical:absolute;mso-position-vertical-relative:text;mso-width-percent:0;mso-height-percent:0;mso-width-relative:margin;mso-height-relative:margin;v-text-anchor:middle" o:gfxdata="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" fillcolor="white [3201]" strokecolor="#70ad47 [3209]" strokeweight="1pt">
                 <v:stroke joinstyle="miter"/>
                 <v:textbox>
                   <w:txbxContent>
@@ -1388,7 +1388,7 @@
           </mc:Choice>
           <mc:Fallback>
             <w:pict>
-              <v:oval w14:anchorId="2721A364" id="Oval 10" o:spid="_x0000_s1032" style="position:absolute;margin-left:48.9pt;margin-top:24.25pt;width:57.75pt;height:52.5pt;z-index:-251648000;visibility:visible;mso-wrap-style:square;mso-wrap-distance-left:9pt;mso-wrap-distance-top:0;mso-wrap-distance-right:9pt;mso-wrap-distance-bottom:0;mso-position-horizontal:absolute;mso-position-horizontal-relative:text;mso-position-vertical:absolute;mso-position-vertical-relative:text;v-text-anchor:middle" o:gfxdata="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" fillcolor="#4472c4 [3204]" strokecolor="#1f3763 [1604]" strokeweight="1pt">
+              <v:oval w14:anchorId="2721A364" id="Oval 10" o:spid="_x0000_s1032" style="position:absolute;margin-left:48.9pt;margin-top:24.25pt;width:57.75pt;height:52.5pt;z-index:-251648000;visibility:visible;mso-wrap-style:square;mso-wrap-distance-left:9pt;mso-wrap-distance-top:0;mso-wrap-distance-right:9pt;mso-wrap-distance-bottom:0;mso-position-horizontal:absolute;mso-position-horizontal-relative:text;mso-position-vertical:absolute;mso-position-vertical-relative:text;v-text-anchor:middle" o:gfxdata="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" fillcolor="#4472c4 [3204]" strokecolor="#1f3763 [1604]" strokeweight="1pt">
                 <v:stroke joinstyle="miter"/>
                 <v:textbox>
                   <w:txbxContent>
@@ -1525,8 +1525,13 @@
       </w:r>
       <w:proofErr w:type="gramEnd"/>
       <w:r>
-        <w:t xml:space="preserve"> is both .</w:t>
-      </w:r>
+        <w:t xml:space="preserve"> is </w:t>
+      </w:r>
+      <w:proofErr w:type="gramStart"/>
+      <w:r>
+        <w:t>both .</w:t>
+      </w:r>
+      <w:proofErr w:type="gramEnd"/>
     </w:p>
     <w:p>
       <w:pPr>
@@ -2038,10 +2043,12 @@
         <w:t xml:space="preserve"> (</w:t>
       </w:r>
       <w:proofErr w:type="spellStart"/>
+      <w:proofErr w:type="gramStart"/>
       <w:r>
         <w:t>java.lang</w:t>
       </w:r>
       <w:proofErr w:type="spellEnd"/>
+      <w:proofErr w:type="gramEnd"/>
       <w:r>
         <w:t xml:space="preserve"> {auto import})</w:t>
       </w:r>
@@ -2077,7 +2084,31 @@
       </w:r>
       <w:proofErr w:type="gramEnd"/>
       <w:r>
-        <w:t xml:space="preserve"> ’a’ , _ _ _ _ _ _ _ _ _ , ‘1‘ , ‘2’, _ _ _ _ _ _ _ _ _</w:t>
+        <w:t xml:space="preserve"> ’a</w:t>
+      </w:r>
+      <w:proofErr w:type="gramStart"/>
+      <w:r>
+        <w:t>’ ,</w:t>
+      </w:r>
+      <w:proofErr w:type="gramEnd"/>
+      <w:r>
+        <w:t xml:space="preserve"> _ _ _ _ _ _ _ _ </w:t>
+      </w:r>
+      <w:proofErr w:type="gramStart"/>
+      <w:r>
+        <w:t>_ ,</w:t>
+      </w:r>
+      <w:proofErr w:type="gramEnd"/>
+      <w:r>
+        <w:t xml:space="preserve"> ‘</w:t>
+      </w:r>
+      <w:proofErr w:type="gramStart"/>
+      <w:r>
+        <w:t>1‘ ,</w:t>
+      </w:r>
+      <w:proofErr w:type="gramEnd"/>
+      <w:r>
+        <w:t xml:space="preserve"> ‘2’, _ _ _ _ _ _ _ _ _</w:t>
       </w:r>
     </w:p>
     <w:p>
@@ -2412,8 +2443,13 @@
         <w:t xml:space="preserve"> </w:t>
       </w:r>
       <w:r>
-        <w:t>‘t’ ]</w:t>
-      </w:r>
+        <w:t>‘t</w:t>
+      </w:r>
+      <w:proofErr w:type="gramStart"/>
+      <w:r>
+        <w:t>’ ]</w:t>
+      </w:r>
+      <w:proofErr w:type="gramEnd"/>
     </w:p>
     <w:p>
       <w:pPr>
@@ -3897,14 +3933,7 @@
           <w:rFonts w:ascii="Consolas" w:hAnsi="Consolas"/>
           <w:color w:val="3F5FBF"/>
         </w:rPr>
-        <w:t xml:space="preserve">*  </w:t>
-      </w:r>
-      <w:r>
-        <w:rPr>
-          <w:rFonts w:ascii="Consolas" w:hAnsi="Consolas"/>
-          <w:color w:val="3F5FBF"/>
-        </w:rPr>
-        <w:t>After:</w:t>
+        <w:t>*  After:</w:t>
       </w:r>
     </w:p>
     <w:p>
@@ -4027,6 +4056,7 @@
         <w:t>.</w:t>
       </w:r>
     </w:p>
+    <w:p/>
     <w:p/>
     <w:sectPr>
       <w:pgSz w:w="11906" w:h="16838"/>
@@ -4045,7 +4075,7 @@
 </file>
 
 <file path=word/numbering.xml><?xml version="1.0" encoding="utf-8"?>
-<w:numbering xmlns:wpc="http://schemas.microsoft.com/office/word/2010/wordprocessingCanvas" xmlns:cx="http://schemas.microsoft.com/office/drawing/2014/chartex" xmlns:cx1="http://schemas.microsoft.com/office/drawing/2015/9/8/chartex" xmlns:cx2="http://schemas.microsoft.com/office/drawing/2015/10/21/chartex" xmlns:cx3="http://schemas.microsoft.com/office/drawing/2016/5/9/chartex" xmlns:cx4="http://schemas.microsoft.com/office/drawing/2016/5/10/chartex" xmlns:cx5="http://schemas.microsoft.com/office/drawing/2016/5/11/chartex" xmlns:cx6="http://schemas.microsoft.com/office/drawing/2016/5/12/chartex" xmlns:cx7="http://schemas.microsoft.com/office/drawing/2016/5/13/chartex" xmlns:cx8="http://schemas.microsoft.com/office/drawing/2016/5/14/chartex" xmlns:mc="http://schemas.openxmlformats.org/markup-compatibility/2006" xmlns:aink="http://schemas.microsoft.com/office/drawing/2016/ink" xmlns:am3d="http://schemas.microsoft.com/office/drawing/2017/model3d" xmlns:o="urn:schemas-microsoft-com:office:office" xmlns:r="http://schemas.openxmlformats.org/officeDocument/2006/relationships" xmlns:m="http://schemas.openxmlformats.org/officeDocument/2006/math" xmlns:v="urn:schemas-microsoft-com:vml" xmlns:wp14="http://schemas.microsoft.com/office/word/2010/wordprocessingDrawing" xmlns:wp="http://schemas.openxmlformats.org/drawingml/2006/wordprocessingDrawing" xmlns:w10="urn:schemas-microsoft-com:office:word" xmlns:w="http://schemas.openxmlformats.org/wordprocessingml/2006/main" xmlns:w14="http://schemas.microsoft.com/office/word/2010/wordml" xmlns:w15="http://schemas.microsoft.com/office/word/2012/wordml" xmlns:w16cex="http://schemas.microsoft.com/office/word/2018/wordml/cex" xmlns:w16cid="http://schemas.microsoft.com/office/word/2016/wordml/cid" xmlns:w16="http://schemas.microsoft.com/office/word/2018/wordml" xmlns:w16sdtdh="http://schemas.microsoft.com/office/word/2020/wordml/sdtdatahash" xmlns:w16se="http://schemas.microsoft.com/office/word/2015/wordml/symex" xmlns:wpg="http://schemas.microsoft.com/office/word/2010/wordprocessingGroup" xmlns:wpi="http://schemas.microsoft.com/office/word/2010/wordprocessingInk" xmlns:wne="http://schemas.microsoft.com/office/word/2006/wordml" xmlns:wps="http://schemas.microsoft.com/office/word/2010/wordprocessingShape" mc:Ignorable="w14 w15 w16se w16cid w16 w16cex w16sdtdh wp14">
+<w:numbering xmlns:wpc="http://schemas.microsoft.com/office/word/2010/wordprocessingCanvas" xmlns:cx="http://schemas.microsoft.com/office/drawing/2014/chartex" xmlns:cx1="http://schemas.microsoft.com/office/drawing/2015/9/8/chartex" xmlns:cx2="http://schemas.microsoft.com/office/drawing/2015/10/21/chartex" xmlns:cx3="http://schemas.microsoft.com/office/drawing/2016/5/9/chartex" xmlns:cx4="http://schemas.microsoft.com/office/drawing/2016/5/10/chartex" xmlns:cx5="http://schemas.microsoft.com/office/drawing/2016/5/11/chartex" xmlns:cx6="http://schemas.microsoft.com/office/drawing/2016/5/12/chartex" xmlns:cx7="http://schemas.microsoft.com/office/drawing/2016/5/13/chartex" xmlns:cx8="http://schemas.microsoft.com/office/drawing/2016/5/14/chartex" xmlns:mc="http://schemas.openxmlformats.org/markup-compatibility/2006" xmlns:aink="http://schemas.microsoft.com/office/drawing/2016/ink" xmlns:am3d="http://schemas.microsoft.com/office/drawing/2017/model3d" xmlns:o="urn:schemas-microsoft-com:office:office" xmlns:oel="http://schemas.microsoft.com/office/2019/extlst" xmlns:r="http://schemas.openxmlformats.org/officeDocument/2006/relationships" xmlns:m="http://schemas.openxmlformats.org/officeDocument/2006/math" xmlns:v="urn:schemas-microsoft-com:vml" xmlns:wp14="http://schemas.microsoft.com/office/word/2010/wordprocessingDrawing" xmlns:wp="http://schemas.openxmlformats.org/drawingml/2006/wordprocessingDrawing" xmlns:w10="urn:schemas-microsoft-com:office:word" xmlns:w="http://schemas.openxmlformats.org/wordprocessingml/2006/main" xmlns:w14="http://schemas.microsoft.com/office/word/2010/wordml" xmlns:w15="http://schemas.microsoft.com/office/word/2012/wordml" xmlns:w16cex="http://schemas.microsoft.com/office/word/2018/wordml/cex" xmlns:w16cid="http://schemas.microsoft.com/office/word/2016/wordml/cid" xmlns:w16="http://schemas.microsoft.com/office/word/2018/wordml" xmlns:w16du="http://schemas.microsoft.com/office/word/2023/wordml/word16du" xmlns:w16sdtdh="http://schemas.microsoft.com/office/word/2020/wordml/sdtdatahash" xmlns:w16sdtfl="http://schemas.microsoft.com/office/word/2024/wordml/sdtformatlock" xmlns:w16se="http://schemas.microsoft.com/office/word/2015/wordml/symex" xmlns:wpg="http://schemas.microsoft.com/office/word/2010/wordprocessingGroup" xmlns:wpi="http://schemas.microsoft.com/office/word/2010/wordprocessingInk" xmlns:wne="http://schemas.microsoft.com/office/word/2006/wordml" xmlns:wps="http://schemas.microsoft.com/office/word/2010/wordprocessingShape" mc:Ignorable="w14 w15 w16se w16cid w16 w16cex w16sdtdh w16sdtfl w16du wp14">
   <w:abstractNum w:abstractNumId="0" w15:restartNumberingAfterBreak="0">
     <w:nsid w:val="26CC154A"/>
     <w:multiLevelType w:val="hybridMultilevel"/>
@@ -4272,17 +4302,17 @@
       </w:rPr>
     </w:lvl>
   </w:abstractNum>
-  <w:num w:numId="1">
+  <w:num w:numId="1" w16cid:durableId="1992522604">
     <w:abstractNumId w:val="1"/>
   </w:num>
-  <w:num w:numId="2">
+  <w:num w:numId="2" w16cid:durableId="877200827">
     <w:abstractNumId w:val="0"/>
   </w:num>
 </w:numbering>
 </file>
 
 <file path=word/styles.xml><?xml version="1.0" encoding="utf-8"?>
-<w:styles xmlns:mc="http://schemas.openxmlformats.org/markup-compatibility/2006" xmlns:r="http://schemas.openxmlformats.org/officeDocument/2006/relationships" xmlns:w="http://schemas.openxmlformats.org/wordprocessingml/2006/main" xmlns:w14="http://schemas.microsoft.com/office/word/2010/wordml" xmlns:w15="http://schemas.microsoft.com/office/word/2012/wordml" xmlns:w16cex="http://schemas.microsoft.com/office/word/2018/wordml/cex" xmlns:w16cid="http://schemas.microsoft.com/office/word/2016/wordml/cid" xmlns:w16="http://schemas.microsoft.com/office/word/2018/wordml" xmlns:w16sdtdh="http://schemas.microsoft.com/office/word/2020/wordml/sdtdatahash" xmlns:w16se="http://schemas.microsoft.com/office/word/2015/wordml/symex" mc:Ignorable="w14 w15 w16se w16cid w16 w16cex w16sdtdh">
+<w:styles xmlns:mc="http://schemas.openxmlformats.org/markup-compatibility/2006" xmlns:r="http://schemas.openxmlformats.org/officeDocument/2006/relationships" xmlns:w="http://schemas.openxmlformats.org/wordprocessingml/2006/main" xmlns:w14="http://schemas.microsoft.com/office/word/2010/wordml" xmlns:w15="http://schemas.microsoft.com/office/word/2012/wordml" xmlns:w16cex="http://schemas.microsoft.com/office/word/2018/wordml/cex" xmlns:w16cid="http://schemas.microsoft.com/office/word/2016/wordml/cid" xmlns:w16="http://schemas.microsoft.com/office/word/2018/wordml" xmlns:w16du="http://schemas.microsoft.com/office/word/2023/wordml/word16du" xmlns:w16sdtdh="http://schemas.microsoft.com/office/word/2020/wordml/sdtdatahash" xmlns:w16sdtfl="http://schemas.microsoft.com/office/word/2024/wordml/sdtformatlock" xmlns:w16se="http://schemas.microsoft.com/office/word/2015/wordml/symex" mc:Ignorable="w14 w15 w16se w16cid w16 w16cex w16sdtdh w16sdtfl w16du">
   <w:docDefaults>
     <w:rPrDefault>
       <w:rPr>

</xml_diff>